<commit_message>
Rewrite concept note in plain academic prose; add supervisor script
Concept note: removed all em dashes and rewrote in a plainer academic register
with ordinary connectives and topic sentences in place of the punchier style.
The plainer register runs longer, so the text was cut back in two passes to
774 words of body text against the 800-word cap. Word file rebuilt and
revalidated.

Added supervisor-discussion.md: a spoken script for the meeting with Kofi
Amanor. It traces the line from his email to the current design, states the
three departures and why each was forced, sets out six specific field cases the
study will look at, and lists what to ask him for, what to hold, and what to
concede.

Co-Authored-By: Claude Opus 5 <noreply@anthropic.com>
Claude-Session: https://claude.ai/code/session_01FoEay3Zt62trRhNtFZ9bQQ
</commit_message>
<xml_diff>
--- a/acet-ylr-2027/concept-note-sm.docx
+++ b/acet-ylr-2027/concept-note-sm.docx
@@ -37,7 +37,7 @@
           <w:sz w:val="19"/>
           <w:szCs w:val="19"/>
         </w:rPr>
-        <w:t xml:space="preserve">[Your name] · [Institutional affiliation]</w:t>
+        <w:t xml:space="preserve">[Your name], [Institutional affiliation]</w:t>
       </w:r>
     </w:p>
     <w:p>
@@ -103,20 +103,20 @@
           <w:sz w:val="24"/>
           <w:szCs w:val="24"/>
         </w:rPr>
-        <w:t xml:space="preserve">The policy problem</w:t>
-      </w:r>
-    </w:p>
-    <w:p>
-      <w:pPr>
-        <w:spacing w:after="140" w:line="276"/>
-      </w:pPr>
-      <w:r>
-        <w:rPr>
-          <w:rFonts w:ascii="Cambria" w:cs="Cambria" w:eastAsia="Cambria" w:hAnsi="Cambria"/>
-          <w:sz w:val="22"/>
-          <w:szCs w:val="22"/>
-        </w:rPr>
-        <w:t xml:space="preserve">Green industrial policy in Africa is financed against units deployed. Results-based financing pays suppliers per verified device installed; national plans report dryers, ovens and cold storage disseminated. Deployment is a procurement outcome. Green industrialisation — low-carbon production, value addition, decent jobs — requires that equipment be used to make something more valuable. If much deployed equipment never enters production, these instruments are priced against the wrong metric, and no one knows the share.</w:t>
+        <w:t xml:space="preserve">Background</w:t>
+      </w:r>
+    </w:p>
+    <w:p>
+      <w:pPr>
+        <w:spacing w:after="140" w:line="276"/>
+      </w:pPr>
+      <w:r>
+        <w:rPr>
+          <w:rFonts w:ascii="Cambria" w:cs="Cambria" w:eastAsia="Cambria" w:hAnsi="Cambria"/>
+          <w:sz w:val="22"/>
+          <w:szCs w:val="22"/>
+        </w:rPr>
+        <w:t xml:space="preserve">Green industrial policy in Africa is financed on the basis of units deployed. Results-based financing pays per verified device installed, and national plans report units disseminated. Such figures record procurement, not production. Green industrialisation requires that equipment actually be used to make something of higher value. If much of what is deployed never enters production, these instruments are conditioned on the wrong measure, and that share is currently unknown.</w:t>
       </w:r>
     </w:p>
     <w:p>
@@ -133,20 +133,33 @@
           <w:sz w:val="24"/>
           <w:szCs w:val="24"/>
         </w:rPr>
-        <w:t xml:space="preserve">Positioning</w:t>
-      </w:r>
-    </w:p>
-    <w:p>
-      <w:pPr>
-        <w:spacing w:after="140" w:line="276"/>
-      </w:pPr>
-      <w:r>
-        <w:rPr>
-          <w:rFonts w:ascii="Cambria" w:cs="Cambria" w:eastAsia="Cambria" w:hAnsi="Cambria"/>
-          <w:sz w:val="22"/>
-          <w:szCs w:val="22"/>
-        </w:rPr>
-        <w:t xml:space="preserve">This is an energy-efficiency gap in informal firms. Allcott and Greenstone (2012) model why firms leave privately profitable energy investments unexploited; audited European SMEs adopt only 40–48% of recommended measures. The same gap appears in low-income enterprise settings: Kenyan solar mini-grids produced no business gains after two years (Pueyo et al. 2018), and 75% of connected enterprises in electrified Indian villages draw under 1 kWh daily (Pelz et al. 2021). Yet where identification is strong the mechanism works — South African electrification raised female employment 13.5 points by releasing women from home production into microenterprise (Dinkelman 2011). Separately, urban Ghanaian evidence shows capital alone fails: women's subsistence enterprises gained nothing from cash or in-kind grants, while larger women-owned firms grew only from in-kind capital (Fafchamps et al. 2013). No study joins these when the capital is itself the green technology.</w:t>
+        <w:t xml:space="preserve">Framing and evidence</w:t>
+      </w:r>
+    </w:p>
+    <w:p>
+      <w:pPr>
+        <w:spacing w:after="140" w:line="276"/>
+      </w:pPr>
+      <w:r>
+        <w:rPr>
+          <w:rFonts w:ascii="Cambria" w:cs="Cambria" w:eastAsia="Cambria" w:hAnsi="Cambria"/>
+          <w:sz w:val="22"/>
+          <w:szCs w:val="22"/>
+        </w:rPr>
+        <w:t xml:space="preserve">The problem is an energy efficiency gap among informal firms. Allcott and Greenstone (2012) explain why firms forgo energy investments that are privately profitable, and audited European enterprises adopt only 40 to 48 per cent of recommended measures. The pattern recurs in low-income settings, where 75 per cent of connected enterprises in electrified Indian villages consume under one kilowatt-hour daily (Pelz et al. 2021) and Kenyan mini-grids raised no business performance after two years (Pueyo et al. 2018). The mechanism does operate where identification is strong: Dinkelman (2011) finds South African electrification raised female employment 13.5 percentage points by releasing women from home production into microenterprise.</w:t>
+      </w:r>
+    </w:p>
+    <w:p>
+      <w:pPr>
+        <w:spacing w:after="140" w:line="276"/>
+      </w:pPr>
+      <w:r>
+        <w:rPr>
+          <w:rFonts w:ascii="Cambria" w:cs="Cambria" w:eastAsia="Cambria" w:hAnsi="Cambria"/>
+          <w:sz w:val="22"/>
+          <w:szCs w:val="22"/>
+        </w:rPr>
+        <w:t xml:space="preserve">A second literature reaches a related conclusion about capital. Fafchamps et al. (2013) find that in urban Ghana, women running subsistence enterprises gained nothing from cash or in-kind grants, while larger women-owned firms grew only when capital arrived in kind. Neither literature has examined what happens when the capital is itself the green technology.</w:t>
       </w:r>
     </w:p>
     <w:p>
@@ -173,25 +186,23 @@
       <w:r>
         <w:rPr>
           <w:rFonts w:ascii="Cambria" w:cs="Cambria" w:eastAsia="Cambria" w:hAnsi="Cambria"/>
-          <w:b/>
-          <w:bCs/>
-          <w:sz w:val="22"/>
-          <w:szCs w:val="22"/>
-        </w:rPr>
-        <w:t xml:space="preserve">Conditional on adoption, what converts green processing technology into value addition — and which complementary input binds?</w:t>
-      </w:r>
-    </w:p>
-    <w:p>
-      <w:pPr>
-        <w:spacing w:after="140" w:line="276"/>
-      </w:pPr>
-      <w:r>
-        <w:rPr>
-          <w:rFonts w:ascii="Cambria" w:cs="Cambria" w:eastAsia="Cambria" w:hAnsi="Cambria"/>
-          <w:sz w:val="22"/>
-          <w:szCs w:val="22"/>
-        </w:rPr>
-        <w:t xml:space="preserve">Two hypotheses, not open questions. Fafchamps et al. implies conversion is non-linear in baseline enterprise scale: near zero below a threshold, positive above. Field et al. (2019) implies conversion fails where the household contains a second enterprise, because returns are redirected there.</w:t>
+          <w:sz w:val="22"/>
+          <w:szCs w:val="22"/>
+        </w:rPr>
+        <w:t xml:space="preserve">Conditional on adoption, what converts green processing technology into value addition, and which complementary input is binding?</w:t>
+      </w:r>
+    </w:p>
+    <w:p>
+      <w:pPr>
+        <w:spacing w:after="140" w:line="276"/>
+      </w:pPr>
+      <w:r>
+        <w:rPr>
+          <w:rFonts w:ascii="Cambria" w:cs="Cambria" w:eastAsia="Cambria" w:hAnsi="Cambria"/>
+          <w:sz w:val="22"/>
+          <w:szCs w:val="22"/>
+        </w:rPr>
+        <w:t xml:space="preserve">Two hypotheses follow from existing evidence. Fafchamps et al. imply that conversion is non-linear in enterprise scale, near zero below a threshold and positive above it. Field et al. (2019) imply that conversion is less likely where the household contains a second enterprise, because returns are redirected towards it.</w:t>
       </w:r>
     </w:p>
     <w:p>
@@ -208,33 +219,33 @@
           <w:sz w:val="24"/>
           <w:szCs w:val="24"/>
         </w:rPr>
-        <w:t xml:space="preserve">Setting</w:t>
-      </w:r>
-    </w:p>
-    <w:p>
-      <w:pPr>
-        <w:spacing w:after="140" w:line="276"/>
-      </w:pPr>
-      <w:r>
-        <w:rPr>
-          <w:rFonts w:ascii="Cambria" w:cs="Cambria" w:eastAsia="Cambria" w:hAnsi="Cambria"/>
-          <w:sz w:val="22"/>
-          <w:szCs w:val="22"/>
-        </w:rPr>
-        <w:t xml:space="preserve">Coastal fish smoking, where women are 96.9% of processors. Traditional Chorkor ovens emit polycyclic aromatic hydrocarbons at seven to ten times EU limits; fuel-efficient Ahotor ovens cut them. Because Ghanaian fisheries policy promotes higher-value markets through hygiene certification, the conversion pathway is concrete and measurable: oven, lower PAH, certification eligibility, formal and export buyers. Informal cross-border trade in processed pelagics alone runs to roughly 6,000 tonnes and USD 14 million annually. The Ahotor literature covers adoption drivers and PAH but never enterprise outcomes. Inland cassava and shea processing, using solar drying and powered milling, supplies contrast and the enterprise-scale variation the first hypothesis needs.</w:t>
-      </w:r>
-    </w:p>
-    <w:p>
-      <w:pPr>
-        <w:spacing w:after="140" w:line="276"/>
-      </w:pPr>
-      <w:r>
-        <w:rPr>
-          <w:rFonts w:ascii="Cambria" w:cs="Cambria" w:eastAsia="Cambria" w:hAnsi="Cambria"/>
-          <w:sz w:val="22"/>
-          <w:szCs w:val="22"/>
-        </w:rPr>
-        <w:t xml:space="preserve">Five hundred enterprises — some 300 adopters, 200 non-adopters in the same clusters. Pay-as-you-go solar providers and Ahotor dissemination programmes hold client records carrying installation dates, which the event study requires; cluster enumeration at landing sites captures off-list adopters.</w:t>
+        <w:t xml:space="preserve">Setting and data</w:t>
+      </w:r>
+    </w:p>
+    <w:p>
+      <w:pPr>
+        <w:spacing w:after="140" w:line="276"/>
+      </w:pPr>
+      <w:r>
+        <w:rPr>
+          <w:rFonts w:ascii="Cambria" w:cs="Cambria" w:eastAsia="Cambria" w:hAnsi="Cambria"/>
+          <w:sz w:val="22"/>
+          <w:szCs w:val="22"/>
+        </w:rPr>
+        <w:t xml:space="preserve">The setting is coastal fish smoking, where women are 96.9 per cent of processors. Traditional Chorkor ovens emit polycyclic aromatic hydrocarbons at seven to ten times European Union limits, while fuel-efficient Ahotor ovens reduce them. Because Ghanaian fisheries policy promotes higher-value markets through hygiene certification, the conversion pathway is concrete: the oven lowers contaminant levels, which establishes certification eligibility, which opens formal and export buyers. Existing work on the Ahotor oven covers adoption and contaminant levels but not enterprise outcomes. Inland cassava and shea processing, using solar drying and powered milling, supply contrast and the variation in enterprise scale the first hypothesis needs.</w:t>
+      </w:r>
+    </w:p>
+    <w:p>
+      <w:pPr>
+        <w:spacing w:after="140" w:line="276"/>
+      </w:pPr>
+      <w:r>
+        <w:rPr>
+          <w:rFonts w:ascii="Cambria" w:cs="Cambria" w:eastAsia="Cambria" w:hAnsi="Cambria"/>
+          <w:sz w:val="22"/>
+          <w:szCs w:val="22"/>
+        </w:rPr>
+        <w:t xml:space="preserve">The sample is 500 enterprises, roughly 300 adopters and 200 non-adopters from the same clusters, drawn from pay-as-you-go solar and Ahotor programme records, which carry the installation dates the event study requires, and from enumeration at landing sites.</w:t>
       </w:r>
     </w:p>
     <w:p>
@@ -264,20 +275,20 @@
           <w:sz w:val="22"/>
           <w:szCs w:val="22"/>
         </w:rPr>
-        <w:t xml:space="preserve">A retrospective enterprise panel supports an event study with enterprise fixed effects around adoption timing. A converter/non-converter comparison holds adoption constant, removing selection into adoption while remaining explicitly diagnostic. A discrete choice experiment — cleanly experimental — randomises support packages across capital form, training, supervision, after-sales service and certification linkage, each attribute drawn from a documented finding and validated in formative interviews before fielding. Three hundred adopters across eight tasks yield 2,400 observations for mixed logit.</w:t>
-      </w:r>
-    </w:p>
-    <w:p>
-      <w:pPr>
-        <w:spacing w:after="140" w:line="276"/>
-      </w:pPr>
-      <w:r>
-        <w:rPr>
-          <w:rFonts w:ascii="Cambria" w:cs="Cambria" w:eastAsia="Cambria" w:hAnsi="Cambria"/>
-          <w:sz w:val="22"/>
-          <w:szCs w:val="22"/>
-        </w:rPr>
-        <w:t xml:space="preserve">Two measurement decisions follow the evidence. Profit is elicited directly, since detailed revenue-and-expense questions are less accurate and firms underreport revenues by roughly 30% (de Mel et al. 2009); value added is constructed from physical quantities as a secondary check. Use is verified by enumerator inspection — functionality, evidence of recent use, photographs — because survey self-report overstates stove use by 28–46% and misses dis-adoption entirely (Hing et al. 2023). The reported-versus-verified gap is itself a reported result.</w:t>
+        <w:t xml:space="preserve">Three strategies are combined. A retrospective panel supports an event study with enterprise fixed effects around adoption timing. Comparing converters with non-converters holds adoption constant, removing selection into adoption while remaining diagnostic rather than causal. A discrete choice experiment, fully experimental, randomises support packages across capital form, training, supervision, after-sales service and certification linkage, with attributes validated in formative interviews beforehand. Three hundred adopters completing eight tasks yield 2,400 observations for mixed logit estimation.</w:t>
+      </w:r>
+    </w:p>
+    <w:p>
+      <w:pPr>
+        <w:spacing w:after="140" w:line="276"/>
+      </w:pPr>
+      <w:r>
+        <w:rPr>
+          <w:rFonts w:ascii="Cambria" w:cs="Cambria" w:eastAsia="Cambria" w:hAnsi="Cambria"/>
+          <w:sz w:val="22"/>
+          <w:szCs w:val="22"/>
+        </w:rPr>
+        <w:t xml:space="preserve">Two measurement decisions follow from the evidence. Profit is elicited directly, since detailed revenue and expense questions are less accurate and firms underreport revenues by roughly 30 per cent (de Mel et al. 2009). Use is verified by enumerator inspection, since self-reports overstate use by 28 to 46 per cent and miss disadoption (Hing et al. 2023). The gap between reported and verified use is itself a result.</w:t>
       </w:r>
     </w:p>
     <w:p>
@@ -307,7 +318,7 @@
           <w:sz w:val="22"/>
           <w:szCs w:val="22"/>
         </w:rPr>
-        <w:t xml:space="preserve">Primary: enterprise profit per hour of processing labour. Secondary: verified productive use; certification status and buyer type; months operated; paid employment; spoilage; energy cost per kilogramme processed; women's control over revenue. Energy is measured as intensity, not level — if conversion succeeds, output expands and total fuel spend may rise. With roughly 165 converters against 135 non-converters, the design detects 0.33 standard deviations at 80% power.</w:t>
+        <w:t xml:space="preserve">The primary outcome is enterprise profit per hour of processing labour. Secondary outcomes are verified use, certification status and buyer type, months operated, paid employment, spoilage, energy cost per kilogramme processed, and women's control over revenue. Energy is measured as intensity, not level, since successful conversion expands output and total fuel spending may rise. With 165 converters and 135 non-converters, the design detects 0.33 standard deviations at 80 per cent power.</w:t>
       </w:r>
     </w:p>
     <w:p>
@@ -324,33 +335,33 @@
           <w:sz w:val="24"/>
           <w:szCs w:val="24"/>
         </w:rPr>
-        <w:t xml:space="preserve">Contribution and policy</w:t>
-      </w:r>
-    </w:p>
-    <w:p>
-      <w:pPr>
-        <w:spacing w:after="140" w:line="276"/>
-      </w:pPr>
-      <w:r>
-        <w:rPr>
-          <w:rFonts w:ascii="Cambria" w:cs="Cambria" w:eastAsia="Cambria" w:hAnsi="Cambria"/>
-          <w:sz w:val="22"/>
-          <w:szCs w:val="22"/>
-        </w:rPr>
-        <w:t xml:space="preserve">The first verified conversion rate for green processing technology in Africa, and an experimental ranking of what closes the gap. The nearest studies estimate adoption-to-earnings associations — Nigerian MSMEs by matching (Owusu-Sekyere et al. 2024), Kenyan solar irrigation adopters against non-adopters (Duke and Shell Foundation 2025); neither measures conversion or identifies the binding constraint.</w:t>
-      </w:r>
-    </w:p>
-    <w:p>
-      <w:pPr>
-        <w:spacing w:after="140" w:line="276"/>
-      </w:pPr>
-      <w:r>
-        <w:rPr>
-          <w:rFonts w:ascii="Cambria" w:cs="Cambria" w:eastAsia="Cambria" w:hAnsi="Cambria"/>
-          <w:sz w:val="22"/>
-          <w:szCs w:val="22"/>
-        </w:rPr>
-        <w:t xml:space="preserve">Green industrial support is meant to be conditional, performance-based and tied to value addition. Results-based financing currently conditions on deployment because conversion is unmeasured. This study makes it measurable.</w:t>
+        <w:t xml:space="preserve">Contribution and policy relevance</w:t>
+      </w:r>
+    </w:p>
+    <w:p>
+      <w:pPr>
+        <w:spacing w:after="140" w:line="276"/>
+      </w:pPr>
+      <w:r>
+        <w:rPr>
+          <w:rFonts w:ascii="Cambria" w:cs="Cambria" w:eastAsia="Cambria" w:hAnsi="Cambria"/>
+          <w:sz w:val="22"/>
+          <w:szCs w:val="22"/>
+        </w:rPr>
+        <w:t xml:space="preserve">The study produces the first verified conversion rate for green processing technology in Africa, with an experimental ranking of what closes the gap. The nearest studies estimate adoption-earnings associations in Nigeria (Owusu-Sekyere et al. 2024) and Kenya (Duke and Shell Foundation 2025), but neither measures conversion nor identifies the binding constraint.</w:t>
+      </w:r>
+    </w:p>
+    <w:p>
+      <w:pPr>
+        <w:spacing w:after="140" w:line="276"/>
+      </w:pPr>
+      <w:r>
+        <w:rPr>
+          <w:rFonts w:ascii="Cambria" w:cs="Cambria" w:eastAsia="Cambria" w:hAnsi="Cambria"/>
+          <w:sz w:val="22"/>
+          <w:szCs w:val="22"/>
+        </w:rPr>
+        <w:t xml:space="preserve">Green industrial support is meant to be conditional and performance-based. Results-based financing conditions on deployment because conversion has never been measured. This study makes it measurable.</w:t>
       </w:r>
     </w:p>
     <w:p>
@@ -380,7 +391,7 @@
           <w:sz w:val="22"/>
           <w:szCs w:val="22"/>
         </w:rPr>
-        <w:t xml:space="preserve">Clearance and instruments (M1–2), formative interviews and pilot (M3), survey (M4–5), explanatory interviews (M6), analysis (M7–8), working paper (M9–10), Accra validation workshop (M11), dissemination (M12). USD 14,300 against the 15,000 ceiling.</w:t>
+        <w:t xml:space="preserve">The schedule allows two months for clearance and instrument design, one for formative interviews and piloting, two for the survey, one for explanatory interviews, four for analysis and writing, and two for an Accra validation workshop and dissemination. The budget is USD 14,300 against the USD 15,000 ceiling.</w:t>
       </w:r>
     </w:p>
     <w:sectPr>

</xml_diff>